<commit_message>
fix(journal): resolve KaTeX math mode underscore error in equations (1) and (2)
</commit_message>
<xml_diff>
--- a/Skripsi/Journal_Rafif_Arsya_Pradiva_22.N4.0014.docx
+++ b/Skripsi/Journal_Rafif_Arsya_Pradiva_22.N4.0014.docx
@@ -611,7 +611,7 @@
           <w:i/>
           <w:sz w:val="22"/>
         </w:rPr>
-        <w:t>\text{Late Fee} = \begin{cases} 0.05 \times \text{Tarif Pokok}, &amp; \text{if } \text{status} = \text{'terlambat'} \land \text{nominal\_denda} = 0 \land \Delta\text{Month} \ge 1 \\ 0, &amp; \text{otherwise} \end{cases} \quad (1)</w:t>
+        <w:t>\text{Late Fee} = \begin{cases} 0.05 \times \text{Tarif Pokok}, &amp; \text{if } \text{status} = \text{'terlambat'} \land \text{nominal}_{\text{denda}} = 0 \land \Delta\text{Month} \ge 1 \\ 0, &amp; \text{otherwise} \end{cases} \quad (1)</w:t>
       </w:r>
     </w:p>
     <w:p>
@@ -776,7 +776,7 @@
           <w:i/>
           <w:sz w:val="22"/>
         </w:rPr>
-        <w:t>\text{Signature}_{\text{calc}} = \text{SHA-512}(\text{order\_id} + \text{status\_code} + \text{gross\_amount} + \text{ServerKey}) \quad (2)</w:t>
+        <w:t>\text{Signature}_{\text{calc}} = \text{SHA-512}(\text{order}_{\text{id}} + \text{status}_{\text{code}} + \text{gross}_{\text{amount}} + \text{ServerKey}) \quad (2)</w:t>
       </w:r>
     </w:p>
     <w:p>

</xml_diff>

<commit_message>
docs(journal): eliminate source code listings and sanitize inline symbols for clean 8-page academic narrative
</commit_message>
<xml_diff>
--- a/Skripsi/Journal_Rafif_Arsya_Pradiva_22.N4.0014.docx
+++ b/Skripsi/Journal_Rafif_Arsya_Pradiva_22.N4.0014.docx
@@ -87,7 +87,7 @@
           <w:rFonts w:ascii="Times New Roman" w:hAnsi="Times New Roman"/>
           <w:sz w:val="24"/>
         </w:rPr>
-        <w:t>Student accommodation facilities in expanding higher education districts often suffer from administrative vulnerabilities caused by manual bookkeeping, fragmented messaging, and unverified bank transfers. These informal workflows lead to uncollected revenue, booking collisions during academic admissions, and labor-intensive financial reconciliation. To resolve these bottlenecks, this study designs, implements, and evaluates an integrated management information system for Asri Boarding House in Semarang, Indonesia. Developed using the Waterfall lifecycle, the platform couples Laravel 11 with a 3NF relational database of 22 entities in MySQL 8.0, integrating Midtrans Snap v2 for BCA Virtual Account settlements and Fonnte for automated WhatsApp dispatches. Concurrency control during peak booking demand is enforced via pessimistic row-level locking (`lockForUpdate()`), complemented by an operational post-checkout sanitation hold. An autonomous cron billing pipeline schedules monthly invoices, calculates an idempotent 5% calendar-rollover late fee, and triggers guardian arrears escalation upon consecutive defaults. Functional testing across 60 black-box scenarios achieved a 100% pass rate, corroborated by 510 automated PHPUnit integration tests with 2,211 assertions. Field usability evaluation with the senior resident manager confirmed the system compressed monthly reconciliation from 3–5 days to instant ledger generation, achieving a 9.5/10 usability score.</w:t>
+        <w:t>Student accommodation facilities in expanding higher education districts often suffer from administrative vulnerabilities caused by manual bookkeeping, fragmented messaging, and unverified bank transfers. These informal workflows lead to uncollected revenue, booking collisions during academic admissions, and labor-intensive financial reconciliation. To resolve these bottlenecks, this study designs, implements, and evaluates an integrated management information system for Asri Boarding House in Semarang, Indonesia. Developed using the Waterfall lifecycle, the platform couples Laravel 11 with a 3NF relational database of 22 entities in MySQL 8.0, integrating Midtrans Snap v2 for BCA Virtual Account settlements and Fonnte for automated WhatsApp dispatches. Concurrency control during peak booking demand is enforced via pessimistic row-level locking (*lockForUpdate()*), complemented by an operational post-checkout sanitation hold. An autonomous cron billing pipeline schedules monthly invoices, calculates an idempotent 5% calendar-rollover late fee, and triggers guardian arrears escalation upon consecutive defaults. Functional testing across 60 black-box scenarios achieved a 100% pass rate, corroborated by 510 automated PHPUnit integration tests with 2,211 assertions. Field usability evaluation with the senior resident manager confirmed the system compressed monthly reconciliation from 3–5 days to instant ledger generation, achieving a 9.5/10 usability score.</w:t>
       </w:r>
     </w:p>
     <w:p>
@@ -245,11 +245,11 @@
         <w:br/>
         <w:t>2. Formulation of a staged arrears notification protocol that issues tenant reminders and programmatically escalates unresolved defaults to documented guardians through WhatsApp;</w:t>
         <w:br/>
-        <w:t>3. Elimination of concurrent room reservation collisions during enrollment surges via pessimistic row-level locking (`SELECT ... FOR UPDATE`) within isolated database transactions;</w:t>
+        <w:t>3. Elimination of concurrent room reservation collisions during enrollment surges via pessimistic row-level locking (*SELECT ... FOR UPDATE*) within isolated database transactions;</w:t>
         <w:br/>
         <w:t>4. Implementation of an administrative post-occupancy quarantine mechanism that locks vacated units in a maintenance hold pending physical room turnover;</w:t>
         <w:br/>
-        <w:t>5. Introduction of an in-browser receipt compilation pipeline using `html2pdf.js`, supplying cryptographic-styled transaction proofs while relieving server CPU and shared storage resources.</w:t>
+        <w:t>5. Introduction of an in-browser receipt compilation pipeline using *html2pdf.js*, supplying cryptographic-styled transaction proofs while relieving server CPU and shared storage resources.</w:t>
       </w:r>
     </w:p>
     <w:p>
@@ -353,7 +353,7 @@
           <w:rFonts w:ascii="Times New Roman" w:hAnsi="Times New Roman"/>
           <w:sz w:val="24"/>
         </w:rPr>
-        <w:t>To ensure architectural separation of concerns, the application is organized under a 3-tier Model-View-Controller (MVC) pattern utilizing Laravel 11 executing in a PHP 8.2 runtime environment. Rather than centralizing transactional processes inside routing handlers, core domain workflows are encapsulated within dedicated service classes residing in `app/Services/` (`BillingService`, `MidtransService`, `ReservasiService`, `TransisiPenyewaService`, and `FonnteService`), keeping controller classes minimal and facilitating isolated integration testing.</w:t>
+        <w:t>To ensure architectural separation of concerns, the application is organized under a 3-tier Model-View-Controller (MVC) pattern utilizing Laravel 11 executing in a PHP 8.2 runtime environment. Rather than centralizing transactional processes inside routing handlers, core domain workflows are encapsulated within dedicated service classes residing in *app/Services/* (*BillingService*, *MidtransService*, *ReservasiService*, *TransisiPenyewaService*, and *FonnteService*), keeping controller classes minimal and facilitating isolated integration testing.</w:t>
       </w:r>
     </w:p>
     <w:p>
@@ -395,36 +395,21 @@
           <w:rFonts w:ascii="Times New Roman" w:hAnsi="Times New Roman"/>
           <w:sz w:val="24"/>
         </w:rPr>
-        <w:t>The data layer runs on MySQL 8.0 InnoDB, normalized to Third Normal Form (3NF) across 22 relational entities. Critical domain tables incorporate soft-delete timestamps (`deleted_at`) for audit compliance and historical recovery. However, standard SQL unique keys conflict with soft-deletion mechanisms because archived rows prevent re-registration of identical unique values (e.g., NIK, email, room numbers). To resolve this without abandoning database-level unicity, we implemented **Virtual Generated Columns** combined with unique indices. As shown in Listing 1, each virtual column evaluates to the original column value only while `deleted_at IS NULL`, yielding `NULL` once an entry is marked as deleted. Because SQL semantics permit multiple `NULL` values in a unique index, uniqueness is strictly enforced across active records while preserving soft-deleted historical data.</w:t>
+        <w:t>The persistence layer executes on MySQL 8.0 InnoDB, normalized to Third Normal Form (3NF) across 22 relational entities. Critical domain tables incorporate soft-delete timestamps (*deleted_at*) for audit compliance and historical recovery. However, standard SQL unique keys conflict with soft-deletion mechanisms because archived rows prevent re-registration of identical unique values, such as national identification numbers (*nik*), email addresses, and room numbers. In standard web engineering, practitioners frequently resolve this conflict by removing database-level unique constraints in favor of application-layer validation rules, leaving the underlying relational engine vulnerable to concurrent insertion race conditions.</w:t>
       </w:r>
     </w:p>
     <w:p>
       <w:pPr>
-        <w:spacing w:before="80" w:after="80" w:line="240" w:lineRule="auto"/>
-        <w:ind w:left="170"/>
+        <w:spacing w:before="0" w:after="60" w:line="240" w:lineRule="auto"/>
+        <w:ind w:firstLine="340"/>
+        <w:jc w:val="both"/>
       </w:pPr>
       <w:r>
         <w:rPr>
-          <w:rFonts w:ascii="Consolas" w:hAnsi="Consolas"/>
-          <w:sz w:val="17"/>
+          <w:rFonts w:ascii="Times New Roman" w:hAnsi="Times New Roman"/>
+          <w:sz w:val="24"/>
         </w:rPr>
-        <w:t>// Listing 1. Virtual Generated Columns for Soft-Delete Unicity</w:t>
-        <w:br/>
-        <w:t>Schema::create('users', function (Blueprint $table) {</w:t>
-        <w:br/>
-        <w:t xml:space="preserve">    $table-&gt;id();</w:t>
-        <w:br/>
-        <w:t xml:space="preserve">    $table-&gt;string('email', 100);</w:t>
-        <w:br/>
-        <w:t xml:space="preserve">    $table-&gt;softDeletes();</w:t>
-        <w:br/>
-        <w:t xml:space="preserve">    $table-&gt;string('active_email')</w:t>
-        <w:br/>
-        <w:t xml:space="preserve">          -&gt;virtualAs('CASE WHEN deleted_at IS NULL THEN email ELSE NULL END');</w:t>
-        <w:br/>
-        <w:t xml:space="preserve">    $table-&gt;unique('active_email', 'uq_users_active_email');</w:t>
-        <w:br/>
-        <w:t>});</w:t>
+        <w:t>To resolve this architectural trade-off without abandoning database-level unicity, the system implements Virtual Generated Columns paired with native unique indices. For each unique attribute, a virtual column (such as *active_email*, *active_no_hp*, and *active_nik*) is defined via the conditional expression *CASE WHEN deleted_at IS NULL THEN column_val ELSE NULL END*. Because SQL semantics and the InnoDB engine permit multiple *NULL* values within a unique index, uniqueness is strictly enforced across active records while preserving soft-deleted historical rows. Any simultaneous insertion attempt of duplicate active credentials is automatically intercepted and rejected at the database engine tier, guaranteeing relational consistency without compromising audit history.</w:t>
       </w:r>
     </w:p>
     <w:p>
@@ -452,7 +437,7 @@
           <w:rFonts w:ascii="Times New Roman" w:hAnsi="Times New Roman"/>
           <w:sz w:val="24"/>
         </w:rPr>
-        <w:t>Race conditions pose a substantial operational hazard during university intake surges, where prospective tenants may attempt to book the identical unit at the same second. Addressing this concurrency challenge at the data tier, the system employs **pessimistic row-level locking** (`SELECT ... FOR UPDATE`) enclosed within isolated database transactions.</w:t>
+        <w:t>Race conditions pose a substantial operational hazard during university intake surges, where prospective tenants may attempt to reserve the identical accommodation unit at the same fraction of a second. Addressing this concurrency challenge at the data tier, the system employs pessimistic row-level locking (*SELECT ... FOR UPDATE*) enclosed within isolated, ACID-compliant database transactions.</w:t>
       </w:r>
     </w:p>
     <w:p>
@@ -466,104 +451,7 @@
           <w:rFonts w:ascii="Times New Roman" w:hAnsi="Times New Roman"/>
           <w:sz w:val="24"/>
         </w:rPr>
-        <w:t>Listing 2 details how `ReservasiService` intercepts incoming reservations by acquiring an exclusive row lock on the target room record before evaluating date overlap. Secondary requests attempting to reserve the locked entity are placed in a wait state until the primary transaction completes execution or triggers a rollback, enforcing deterministic serializability across room inventories.</w:t>
-      </w:r>
-    </w:p>
-    <w:p>
-      <w:pPr>
-        <w:spacing w:before="80" w:after="80" w:line="240" w:lineRule="auto"/>
-        <w:ind w:left="170"/>
-      </w:pPr>
-      <w:r>
-        <w:rPr>
-          <w:rFonts w:ascii="Consolas" w:hAnsi="Consolas"/>
-          <w:sz w:val="17"/>
-        </w:rPr>
-        <w:t>// Listing 2. Pessimistic Locking Implementation in ReservasiService</w:t>
-        <w:br/>
-        <w:t>return DB::transaction(function () use ($data) {</w:t>
-        <w:br/>
-        <w:t xml:space="preserve">    $kamar = Kamar::lockForUpdate()-&gt;findOrFail($data['kamar_id']);</w:t>
-      </w:r>
-    </w:p>
-    <w:p>
-      <w:pPr>
-        <w:spacing w:before="0" w:after="60" w:line="240" w:lineRule="auto"/>
-        <w:ind w:firstLine="340"/>
-        <w:jc w:val="both"/>
-      </w:pPr>
-      <w:r>
-        <w:rPr>
-          <w:rFonts w:ascii="Times New Roman" w:hAnsi="Times New Roman"/>
-          <w:sz w:val="24"/>
-        </w:rPr>
-        <w:t>if ($this-&gt;cekDoubleBooking($kamar, $data['tanggal_mulai'], $data['tanggal_selesai'])) {</w:t>
-        <w:br/>
-        <w:t xml:space="preserve">        throw ValidationException::withMessages([</w:t>
-        <w:br/>
-        <w:t xml:space="preserve">            'kamar_id' =&gt; 'Room is already booked for the selected date range.'</w:t>
-        <w:br/>
-        <w:t xml:space="preserve">        ]);</w:t>
-        <w:br/>
-        <w:t xml:space="preserve">    }</w:t>
-      </w:r>
-    </w:p>
-    <w:p>
-      <w:pPr>
-        <w:spacing w:before="0" w:after="60" w:line="240" w:lineRule="auto"/>
-        <w:ind w:firstLine="340"/>
-        <w:jc w:val="both"/>
-      </w:pPr>
-      <w:r>
-        <w:rPr>
-          <w:rFonts w:ascii="Times New Roman" w:hAnsi="Times New Roman"/>
-          <w:sz w:val="24"/>
-        </w:rPr>
-        <w:t>$rincianHarga = $this-&gt;hitungHarga($kamar, $data['tipe_sewa'], $data['durasi']);</w:t>
-      </w:r>
-    </w:p>
-    <w:p>
-      <w:pPr>
-        <w:spacing w:before="0" w:after="60" w:line="240" w:lineRule="auto"/>
-        <w:ind w:firstLine="340"/>
-        <w:jc w:val="both"/>
-      </w:pPr>
-      <w:r>
-        <w:rPr>
-          <w:rFonts w:ascii="Times New Roman" w:hAnsi="Times New Roman"/>
-          <w:sz w:val="24"/>
-        </w:rPr>
-        <w:t>return Reservasi::create(array_merge($data, [</w:t>
-        <w:br/>
-        <w:t xml:space="preserve">        'order_id'     =&gt; "RSV-{$data['user_id']}-" . time(),</w:t>
-        <w:br/>
-        <w:t xml:space="preserve">        'total_harga'  =&gt; $rincianHarga['total_harga'],</w:t>
-        <w:br/>
-        <w:t xml:space="preserve">        'nominal_dp'   =&gt; $rincianHarga['nominal_dp'],</w:t>
-        <w:br/>
-        <w:t xml:space="preserve">        'nominal_sisa' =&gt; $rincianHarga['nominal_sisa'],</w:t>
-        <w:br/>
-        <w:t xml:space="preserve">        'status'       =&gt; 'pending',</w:t>
-        <w:br/>
-        <w:t xml:space="preserve">    ]));</w:t>
-        <w:br/>
-        <w:t>});</w:t>
-        <w:br/>
-        <w:t>```</w:t>
-      </w:r>
-    </w:p>
-    <w:p>
-      <w:pPr>
-        <w:spacing w:before="0" w:after="60" w:line="240" w:lineRule="auto"/>
-        <w:ind w:firstLine="340"/>
-        <w:jc w:val="both"/>
-      </w:pPr>
-      <w:r>
-        <w:rPr>
-          <w:rFonts w:ascii="Times New Roman" w:hAnsi="Times New Roman"/>
-          <w:sz w:val="24"/>
-        </w:rPr>
-        <w:t>In execution, when Thread A initiates a booking request for Room ID 5, the database engine locks the row immediately. If Thread B simultaneously attempts to book Room ID 5, it is forced into a queue wait state. Thread A evaluates the date overlap, confirms availability, generates the pending reservation order, and commits the transaction, releasing the lock. Thread B immediately acquires the released lock, evaluates date overlap against the newly committed reservation, detects collision, and throws a validation exception with HTTP 422, cleanly preventing double bookings without race hazards.</w:t>
+        <w:t>Within the core reservation domain (*ReservasiService*), every reservation attempt initiates an atomic database transaction that immediately issues an exclusive row-level lock on the target room record (*Kamar::lockForUpdate()*) prior to evaluating occupancy schedules. Secondary requests attempting to reserve the locked entity are placed in an engine-managed wait queue until the primary transaction completes execution or triggers a rollback. The locked thread executes schedule collision evaluation (*cekDoubleBooking()*), calculating whether the selected start and end dates intersect with existing active reservations or confirmed tenancies. If a conflict is detected, the transaction aborts with a validation exception (HTTP 422). Conversely, if the unit is unheld, the service calculates pricing breakdowns, records the order in *pending* status, and commits the transaction, releasing the lock. The queued secondary transaction then acquires the released lock, evaluates the newly committed reservation interval, detects collision, and terminates cleanly. This transactional serialization enforces deterministic serializability across room inventories, precluding double allocations without application deadlocks.</w:t>
       </w:r>
     </w:p>
     <w:p>
@@ -591,13 +479,13 @@
           <w:rFonts w:ascii="Times New Roman" w:hAnsi="Times New Roman"/>
           <w:sz w:val="24"/>
         </w:rPr>
-        <w:t>Recurring financial routines rely on host daemon cron tasks triggering Laravel's scheduled commands at one-minute intervals (`* * * * * php artisan schedule:run`). On the 1st day of each calendar month at 00:05 WIB, the automated billing routine executes within `BillingService` through a staged pipeline:</w:t>
+        <w:t>Recurring financial routines rely on host daemon cron tasks triggering Laravel scheduled commands at one-minute intervals. On the 1st day of each calendar month at 00:05 WIB, the automated billing routine executes within *BillingService* through a staged pipeline:</w:t>
         <w:br/>
-        <w:t>1. *Initial Invoice Issuance (1st of the Month)*: The scheduler iterates through active lease agreements (`penyewa.status = 'aktif'`), generating `pending` billing records with a standard settlement window closing on the 10th. Tailored WhatsApp dispatches containing assigned virtual account details are immediately pushed to residents through the Fonnte gateway.</w:t>
+        <w:t>1. *Initial Invoice Issuance (1st of the Month)*: The scheduler iterates through active lease agreements (*status = 'aktif'*), generating *pending* billing records with a standard settlement window closing on the 10th. Tailored WhatsApp dispatches containing assigned virtual account details are immediately pushed to residents through the Fonnte gateway.</w:t>
         <w:br/>
-        <w:t>2. *Intra-Month Grace Period (11th to Final Day of Month)*: Invoices that remain unpaid past the 10th transition into `terlambat` status but maintain an **IDR 0** penalty assessment throughout the active month, while periodic automated reminder messages are dispatched via WhatsApp to prompt settlement.</w:t>
+        <w:t>2. *Intra-Month Grace Period (11th to Final Day of Month)*: Invoices that remain unpaid past the 10th transition into *terlambat* status but maintain an IDR 0 penalty assessment throughout the active month, while periodic automated reminder messages are dispatched via WhatsApp to prompt settlement.</w:t>
         <w:br/>
-        <w:t>3. *Calendar-Boundary Late Fee Assessment (1st of Month $M+1$)*: Upon crossing into the subsequent calendar month without settlement, the system calculates an idempotent 5% penalty levied against the room's base tariff:</w:t>
+        <w:t>3. *Calendar-Boundary Late Fee Assessment (1st of Month $M+1$)*: Upon crossing into the subsequent calendar month without settlement, the system calculates an idempotent 5% penalty levied against the room base tariff:</w:t>
       </w:r>
     </w:p>
     <w:p>
@@ -625,7 +513,7 @@
           <w:rFonts w:ascii="Times New Roman" w:hAnsi="Times New Roman"/>
           <w:sz w:val="24"/>
         </w:rPr>
-        <w:t>Should default persist across two back-to-back monthly cycles (reaching the 10th day of Month $M+1$), the platform initiates guardian arrears escalation, dispatching automated arrears notices directly to the verified mobile contact of the tenant's parent or legal guardian.</w:t>
+        <w:t>Should default persist across two back-to-back monthly cycles (reaching the 10th day of Month $M+1$), the platform initiates guardian arrears escalation, dispatching automated arrears notices directly to the verified mobile contact of the tenant parent or legal guardian.</w:t>
       </w:r>
     </w:p>
     <w:p>
@@ -653,7 +541,7 @@
           <w:rFonts w:ascii="Times New Roman" w:hAnsi="Times New Roman"/>
           <w:sz w:val="24"/>
         </w:rPr>
-        <w:t>Software correctness, robustness, and operational feasibility were verified using a multi-tiered empirical testing framework comprising four coordinated methodologies: (1) black box behavioral validation spanning 60 structured test scenarios developed according to standard software testing guidelines [14], [15]; (2) unit and integration regression suites executed through 510 automated PHPUnit test routines encompassing 2,211 assertions; (3) payment lifecycle simulation conducted within the Midtrans Snap v2 sandbox environment using the Bank BCA Virtual Account testing tool; and (4) direct field usability evaluation alongside structured interviews administered to the senior resident manager (accumulating 20 years of on-site administrative tenure), captured as digital audio evidence (`REKAMAN_UX_ADMIN_KOST_2026.m4a`, total duration 23m 14s).</w:t>
+        <w:t>Software correctness, robustness, and operational feasibility were verified using a multi-tiered empirical testing framework comprising four coordinated methodologies: (1) black box behavioral validation spanning 60 structured test scenarios developed according to standard software testing guidelines [14], [15]; (2) unit and integration regression suites executed through 510 automated PHPUnit test routines encompassing 2,211 assertions; (3) payment lifecycle simulation conducted within the Midtrans Snap v2 sandbox environment using the Bank BCA Virtual Account testing tool; and (4) direct field usability evaluation alongside structured interviews administered to the senior resident manager (accumulating 20 years of on-site administrative tenure), captured as digital audio evidence (*REKAMAN_UX_ADMIN_KOST_2026.m4a*, total duration 23m 14s).</w:t>
       </w:r>
     </w:p>
     <w:p>
@@ -714,17 +602,17 @@
         <w:br/>
         <w:t>Normalized to Third Normal Form (3NF), the persistence layer comprises 22 interrelated database tables organized into six operational functional clusters:</w:t>
         <w:br/>
-        <w:t>- *Identity &amp; Access Cluster*: Anchored by the `users` entity, this cluster manages role-based access control (Admin and Tenant roles), audit trails, and virtual unicity (`active_email`, `active_no_hp`, and `active_nik`) to enforce strict database-level identity uniqueness alongside soft deletes.</w:t>
+        <w:t>- *Identity &amp; Access Cluster*: Anchored by the *users* entity, this cluster manages role-based access control (Admin and Tenant roles), audit trails, and virtual unicity (*active_email*, *active_no_hp*, and *active_nik*) to enforce strict database-level identity uniqueness alongside soft deletes.</w:t>
         <w:br/>
-        <w:t>- *Room Master Cluster*: Encompassing `kamar`, `fasilitas`, and the pivot entity `kamar_fasilitas`, this cluster models 32 physical units distributed across two floors into three pricing tiers (VIP, Deluxe, Standard). It enforces uniqueness on active room numbers (`active_nomor_kamar`) while supporting M:N relationships for room amenities.</w:t>
+        <w:t>- *Room Master Cluster*: Encompassing *kamar*, *fasilitas*, and the pivot entity *kamar_fasilitas*, this cluster models 32 physical units distributed across two floors into three pricing tiers (VIP, Deluxe, Standard). It enforces uniqueness on active room numbers (*active_nomor_kamar*) while supporting M:N relationships for room amenities.</w:t>
         <w:br/>
-        <w:t>- *Tenancy Lifecycle Cluster*: Comprising `penyewa` and `reservasi`, this cluster governs contractual tenancy agreements, base rental rates, security deposits, emergency guardian contact details, and payment plan designations (30% Down Payment or 100% Full Payment).</w:t>
+        <w:t>- *Tenancy Lifecycle Cluster*: Comprising *penyewa* and *reservasi*, this cluster governs contractual tenancy agreements, base rental rates, security deposits, emergency guardian contact details, and payment plan designations (30% Down Payment or 100% Full Payment).</w:t>
         <w:br/>
-        <w:t>- *Finance &amp; Billing Cluster*: Grouping `tagihan`, `pembayaran`, and `pengeluaran`, this cluster tracks monthly rental obligations, sequential invoice numbers, automated late fees, multi-channel payment records (BCA Virtual Account, cash, bank transfer), and operational overhead expenditure logs.</w:t>
+        <w:t>- *Finance &amp; Billing Cluster*: Grouping *tagihan*, *pembayaran*, and *pengeluaran*, this cluster tracks monthly rental obligations, sequential invoice numbers, automated late fees, multi-channel payment records (BCA Virtual Account, cash, bank transfer), and operational overhead expenditure logs.</w:t>
         <w:br/>
-        <w:t>- *Communication Cluster*: Spanning `chat_messages`, `guest_chat_threads`, `guest_chat_messages`, `log_notifikasi`, `pengumuman`, and `notifikasi_khusus`, this cluster coordinates pre-payment prospective tenant chats, public guest inquiries, immutable audit logs for WhatsApp dispatches, institutional broadcasts, and priority transactional alerts.</w:t>
+        <w:t>- *Communication Cluster*: Spanning *chat_messages*, *guest_chat_threads*, *guest_chat_messages*, *log_notifikasi*, *pengumuman*, and *notifikasi_khusus*, this cluster coordinates pre-payment prospective tenant chats, public guest inquiries, immutable audit logs for WhatsApp dispatches, institutional broadcasts, and priority transactional alerts.</w:t>
         <w:br/>
-        <w:t>- *Operations &amp; Content Cluster*: Incorporating `keluhan`, `peraturan`, `customer_reviews`, `faqs`, `galleries`, `settings`, and `whatsapp_clicks`, this cluster manages maintenance tickets with photo uploads, boarding house regulations, moderated public tenant reviews, media galleries, platform configuration parameters, and landing call-to-action click analytics.</w:t>
+        <w:t>- *Operations &amp; Content Cluster*: Incorporating *keluhan*, *peraturan*, *customer_reviews*, *faqs*, *galleries*, *settings*, and *whatsapp_clicks*, this cluster manages maintenance tickets with photo uploads, boarding house regulations, moderated public tenant reviews, media galleries, platform configuration parameters, and landing call-to-action click analytics.</w:t>
       </w:r>
     </w:p>
     <w:p>
@@ -745,7 +633,7 @@
         <w:br/>
         <w:t>- *Digital Self-Service Flow*: Remote prospective residents navigate a guided 5-step checkout interface: (1) Room Inventory Inspection, (2) 16-Digit National Identity (NIK) Syntax Verification, (3) Rental Duration Selection (Daily, Weekly, or Monthly tiers) with automated tenure discounts, (4) Settlement Scheme Designation (30% Down Payment or 100% Full Payment), and (5) Modal Payment via Midtrans Snap v2.</w:t>
         <w:br/>
-        <w:t>- *Front-Desk Walk-In Intake*: For prospective tenants appearing directly on site, the resident manager accesses `/admin/penyewa/create` to record resident and emergency guardian credentials, record direct cash or bank transfers, and assign rooms. The application establishes the user account, tenancy contract, and corresponding invoice record inside an isolated atomic database transaction.</w:t>
+        <w:t>- *Front-Desk Walk-In Intake*: For prospective tenants appearing directly on site, the resident manager accesses the walk-in registration interface to record resident and emergency guardian credentials, record direct cash or bank transfers, and assign rooms. The application establishes the user account, tenancy contract, and corresponding invoice record inside an isolated atomic database transaction.</w:t>
       </w:r>
     </w:p>
     <w:p>
@@ -790,7 +678,7 @@
           <w:rFonts w:ascii="Times New Roman" w:hAnsi="Times New Roman"/>
           <w:sz w:val="24"/>
         </w:rPr>
-        <w:t>The resulting digest is verified against the inbound `signature_key` parameter. Any discrepancy causes the callback listener to terminate with an immediate HTTP 403 Forbidden error. When a valid `settlement` signal is confirmed, `MidtransCallbackController` applies state transitions within a transactional block reinforced with `lockForUpdate()`. In scenarios where network retries deliver identical webhooks, the system observes the existing `lunas` or settled status and skips secondary ledger writes, guaranteeing idempotent financial processing.</w:t>
+        <w:t>The resulting digest is verified against the inbound signature parameter. Any discrepancy causes the callback listener to terminate with an immediate HTTP 403 Forbidden error. When a valid settlement signal is confirmed, *MidtransCallbackController* applies state transitions within a transactional block reinforced with *lockForUpdate()*. In scenarios where network retries deliver identical webhooks, the system observes the existing settled status and skips secondary ledger writes, guaranteeing idempotent financial processing.</w:t>
       </w:r>
     </w:p>
     <w:p>
@@ -807,7 +695,7 @@
         </w:rPr>
         <w:t>4. Operational Quarantine and Digital Receipts</w:t>
         <w:br/>
-        <w:t>Room transitions enforce an explicit physical quarantine protocol upon resident departure. When the manager registers a checkout through `/admin/penyewa/checkout`, the resident’s record is updated to `nonaktif`, yet the room inventory state stays locked as `terisi` (highlighted visually in red on the administrative dashboard). The unit is kept unavailable for new reservations while maintenance personnel perform deep cleaning and facility repairs. Only after physical turnover is signed off does the manager press 'Release Room', returning the unit status to `tersedia` and executing `Cache::forget('kamar_aktif_landing')` to refresh public catalog availability.</w:t>
+        <w:t>Room transitions enforce an explicit physical quarantine protocol upon resident departure. When the manager registers a checkout through the administrative interface, the resident record is updated to inactive (*nonaktif*), yet the room inventory state stays locked as occupied (*terisi*, highlighted visually in red on the administrative dashboard). The unit is kept unavailable for new reservations while maintenance personnel perform deep cleaning and facility repairs. Only after physical turnover is signed off does the manager release the room, returning the unit status to available (*tersedia*) and invalidating the public catalog cache (*Cache::forget*) to refresh live availability.</w:t>
       </w:r>
     </w:p>
     <w:p>
@@ -821,7 +709,7 @@
           <w:rFonts w:ascii="Times New Roman" w:hAnsi="Times New Roman"/>
           <w:sz w:val="24"/>
         </w:rPr>
-        <w:t>To furnish payment proof without burdening hosting infrastructure, the tenant dashboard generates A5 digital receipts on the client side through `html2pdf.js`. Rendering document layouts directly in browser memory protects shared server hosting from CPU contention and storage bloat. Heavyweight server-side document rendering through Dompdf is restricted to monthly financial ledgers compiled exclusively by management.</w:t>
+        <w:t>To furnish payment proof without burdening hosting infrastructure, the tenant dashboard generates A5 digital receipts on the client side through *html2pdf.js*. Rendering document layouts directly in browser memory protects shared server hosting from CPU contention and storage bloat. Heavyweight server-side document rendering through Dompdf is restricted to monthly financial ledgers compiled exclusively by management.</w:t>
       </w:r>
     </w:p>
     <w:p>
@@ -838,7 +726,7 @@
         </w:rPr>
         <w:t>5. Production Deployment and Security Hardening</w:t>
         <w:br/>
-        <w:t>The software solution was placed into live production on Hostinger LiteSpeed Enterprise Cloud hosting (`https://asriboardinghouse.weatso.id/`). Platform hardening incorporated TLS 1.3 transport security (attaining an SSL Grade A profile), frontend asset minification and chunk compression via Vite, Web server `.htaccess` directives barring external access to sensitive paths (`.env`, `.git`), and restricting application entry points strictly to the `/public` directory.</w:t>
+        <w:t>The software solution was placed into live production on Hostinger LiteSpeed Enterprise Cloud hosting (*https://asriboardinghouse.weatso.id/*). Platform hardening incorporated TLS 1.3 transport security (attaining an SSL Grade A profile), frontend asset minification and chunk compression via Vite, Web server configuration directives barring external access to sensitive paths (*.env*, *.git*), and restricting application entry points strictly to the public directory.</w:t>
       </w:r>
     </w:p>
     <w:p>
@@ -863,7 +751,7 @@
         <w:br/>
         <w:t>- *DOM-03 (5-Step Reservation Stepper, Discounts, &amp; Concurrency Locks)*: 10 scenarios assessed form step transitions, NIK regex syntax validation, tenure discount calculations, 30% down payment splits, and pessimistic row locking under rapid simulated clicks, achieving a 100% pass rate.</w:t>
         <w:br/>
-        <w:t>- *DOM-04 (Active Tenant Portal, Self-Service VA, &amp; html2pdf.js Receipts)*: 9 scenarios validated active lease overview displays, dynamic BCA VA modal generation, maintenance ticket submissions with image attachments, and client-side PDF receipt compilation, achieving a 100% pass rate.</w:t>
+        <w:t>- *DOM-04 (Active Tenant Portal, Self-Service VA, &amp; Digital Receipts)*: 9 scenarios validated active lease overview displays, dynamic BCA VA modal generation, maintenance ticket submissions with image attachments, and client-side PDF receipt compilation, achieving a 100% pass rate.</w:t>
         <w:br/>
         <w:t>- *DOM-05 (Admin Console, Walk-In Onboarding, &amp; Inspection Quarantine)*: 13 scenarios tested dashboard occupancy counters, walk-in registration transactions, cash payment settlements, checkout status transitions, room inspection quarantine locking, and financial statement exports, achieving a 100% pass rate.</w:t>
         <w:br/>
@@ -881,7 +769,7 @@
           <w:rFonts w:ascii="Times New Roman" w:hAnsi="Times New Roman"/>
           <w:sz w:val="24"/>
         </w:rPr>
-        <w:t>In addition to black box testing, the software underwent targeted security probes appraising Role-Based Access Control (RBAC) boundaries across protected routes (`/admin`, `/penyewa`, `/reservasi`) alongside OAuth compliance [16]. All six simulated attack vectors were successfully neutralized: (1) unauthenticated requests to `/admin/dashboard` were redirected to login; (2) privilege escalation attempts by active tenants requesting `/admin/laporan` were denied with HTTP 403 Forbidden; (3) public requests to `/penyewa/tagihan` were intercepted and redirected; (4) pending applicants attempting early access to `/penyewa/dashboard` were blocked by middleware; (5) Insecure Direct Object Reference (IDOR) invoice tampering was thwarted by user-scoped Eloquent queries returning HTTP 403; and (6) IDOR receipt tampering was rejected through tenant-payment ownership verification.</w:t>
+        <w:t>In addition to black box testing, the software underwent targeted security probes appraising Role-Based Access Control (RBAC) boundaries across protected routes alongside OAuth compliance [16]. All six simulated attack vectors were successfully neutralized: (1) unauthenticated requests to administrative dashboards were redirected to login; (2) privilege escalation attempts by active tenants requesting administrative reports were denied with HTTP 403 Forbidden; (3) public requests to tenant billing views were intercepted and redirected; (4) pending applicants attempting early access to tenant dashboards were blocked by middleware; (5) Insecure Direct Object Reference (IDOR) invoice tampering was thwarted by user-scoped Eloquent queries returning HTTP 403; and (6) IDOR receipt tampering was rejected through tenant-payment ownership verification.</w:t>
       </w:r>
     </w:p>
     <w:p>
@@ -895,7 +783,7 @@
           <w:rFonts w:ascii="Times New Roman" w:hAnsi="Times New Roman"/>
           <w:sz w:val="24"/>
         </w:rPr>
-        <w:t>Furthermore, payment lifecycle transitions were validated within the Midtrans sandbox environment across all seven lifecycle states: (1) Bank BCA Virtual Account issuance generated a 16-digit code with a 24-hour expiry in `pending` status; (2) simulator payment inquiries retrieved bills accurately; (3) payment triggers dispatched SHA-512 validated webhooks transitioning orders to `settlement`; (4) settlement window expiration automatically transitioned orders to `expire` and released inventory locks; (5) user checkout abortion triggered `cancel` signals; (6) forged SHA-512 signatures were detected and rejected with HTTP 403; and (7) duplicate webhook delivery was processed idempotently without redundant ledger writes.</w:t>
+        <w:t>Furthermore, payment lifecycle transitions were validated within the Midtrans sandbox environment across all seven lifecycle states: (1) Bank BCA Virtual Account issuance generated a 16-digit code with a 24-hour expiry in *pending* status; (2) simulator payment inquiries retrieved bills accurately; (3) payment triggers dispatched SHA-512 validated webhooks transitioning orders to *settlement*; (4) settlement window expiration automatically transitioned orders to *expire* and released inventory locks; (5) user checkout abortion triggered *cancel* signals; (6) forged SHA-512 signatures were detected and rejected with HTTP 403; and (7) duplicate webhook delivery was processed idempotently without redundant ledger writes.</w:t>
       </w:r>
     </w:p>
     <w:p>
@@ -912,7 +800,7 @@
         </w:rPr>
         <w:t>7. Empirical Operational Usability &amp; Stakeholder Evaluation</w:t>
         <w:br/>
-        <w:t>On-site administrative workflow testing and usability validation were carried out at Asri Boarding House directly with resident manager Mr. Asep (48 years of age, 20 years of administrative experience) using the live production instance (`https://asriboardinghouse.weatso.id/`). Conducted under informed consent, the comprehensive session was recorded as continuous digital audio evidence (`REKAMAN_UX_ADMIN_KOST_2026.m4a`, duration 23m 14s). Ten operational modules were systematically examined:</w:t>
+        <w:t>On-site administrative workflow testing and usability validation were carried out at Asri Boarding House directly with resident manager Mr. Asep (48 years of age, 20 years of administrative experience) using the live production instance (*https://asriboardinghouse.weatso.id/*). Conducted under informed consent, the comprehensive session was recorded as continuous digital audio evidence (*REKAMAN_UX_ADMIN_KOST_2026.m4a*, duration 23m 14s). Ten operational modules were systematically examined:</w:t>
         <w:br/>
         <w:t>1. *Public Storefront &amp; Media*: High-contrast typography proved legible for older vision, while upfront room pricing eliminated repetitive rate inquiries from out-of-town parents.</w:t>
         <w:br/>
@@ -988,7 +876,7 @@
           <w:rFonts w:ascii="Times New Roman" w:hAnsi="Times New Roman"/>
           <w:sz w:val="24"/>
         </w:rPr>
-        <w:t>A critical comparison with existing literature highlights several architectural distinctions. Earlier boarding house systems developed by Nizar [3], Purnia et al. [4], and Cornellya &amp; Afriyadi [6] introduced web interfaces for room browsing and record logging, yet they relegated payment verification to manual administrative inspection of uploaded bank slips. By embedding Midtrans Snap v2, the platform presented here shifts transaction settlement from subjective visual checks to deterministic, cryptographically authenticated webhook listeners. Similarly, while lodging architectures presented by Malaikosa &amp; Mokola [7] utilized standard web submission forms vulnerable to concurrent booking conflicts, our implementation enforces database-level serialization via `lockForUpdate()`. Supported by transactional locking models in modern database literature [17], this mechanism guarantees ACID isolation, precluding double-allocation race conditions during high-volume academic enrollment windows.</w:t>
+        <w:t>A critical comparison with existing literature highlights several architectural distinctions. Earlier boarding house systems developed by Nizar [3], Purnia et al. [4], and Cornellya &amp; Afriyadi [6] introduced web interfaces for room browsing and record logging, yet they relegated payment verification to manual administrative inspection of uploaded bank slips. By embedding Midtrans Snap v2, the platform presented here shifts transaction settlement from subjective visual checks to deterministic, cryptographically authenticated webhook listeners. Similarly, while lodging architectures presented by Malaikosa &amp; Mokola [7] utilized standard web submission forms vulnerable to concurrent booking conflicts, our implementation enforces database-level serialization via *lockForUpdate()*. Supported by transactional locking models in modern database literature [17], this mechanism guarantees ACID isolation, precluding double-allocation race conditions during high-volume academic enrollment windows.</w:t>
       </w:r>
     </w:p>
     <w:p>
@@ -1016,7 +904,7 @@
           <w:rFonts w:ascii="Times New Roman" w:hAnsi="Times New Roman"/>
           <w:sz w:val="24"/>
         </w:rPr>
-        <w:t>From a data modeling perspective, the application of Virtual Generated Columns resolves a frequent dilemma in web application engineering: enforcing database unicity across soft-deleted records. In standard Laravel applications, introducing soft deletes often leads practitioners to remove database-level unique constraints in favor of application-layer validation rules, leaving the underlying relational engine susceptible to concurrent insertion conflicts. By defining virtual columns that evaluate to `NULL` upon record deletion, the system enforces unicity strictly at the MySQL engine layer while preserving complete historical audit trails.</w:t>
+        <w:t>From a data modeling perspective, the application of Virtual Generated Columns resolves a frequent dilemma in web application engineering: enforcing database unicity across soft-deleted records. In standard Laravel applications, introducing soft deletes often leads practitioners to remove database-level unique constraints in favor of application-layer validation rules, leaving the underlying relational engine susceptible to concurrent insertion conflicts. By defining virtual columns that evaluate to *NULL* upon record deletion, the system enforces unicity strictly at the MySQL engine layer while preserving complete historical audit trails.</w:t>
       </w:r>
     </w:p>
     <w:p>
@@ -1072,7 +960,7 @@
           <w:rFonts w:ascii="Times New Roman" w:hAnsi="Times New Roman"/>
           <w:sz w:val="24"/>
         </w:rPr>
-        <w:t>This study engineered, deployed, and empirically evaluated an integrated management information system for Asri Boarding House, resolving entrenched operational inefficiencies caused by manual bookkeeping and fragmented communications. Implemented on Laravel 11 with a 3NF-normalized MySQL 8.0 relational schema across 22 entities, the platform delivers automated recurring billing, real-time Virtual Account settlement via Midtrans Snap v2, and automated WhatsApp notifications through Fonnte. The integration of pessimistic database row locking (`lockForUpdate()`) and an administrative post-checkout sanitation lock successfully eliminated room reservation collisions across all tested scenarios, while client-side `html2pdf.js` receipt rendering bypassed server-side storage and computational bottlenecks.</w:t>
+        <w:t>This study engineered, deployed, and empirically evaluated an integrated management information system for Asri Boarding House, resolving entrenched operational inefficiencies caused by manual bookkeeping and fragmented communications. Implemented on Laravel 11 with a 3NF-normalized MySQL 8.0 relational schema across 22 entities, the platform delivers automated recurring billing, real-time Virtual Account settlement via Midtrans Snap v2, and automated WhatsApp notifications through Fonnte. The integration of pessimistic database row locking (*lockForUpdate()*) and an administrative post-checkout sanitation lock successfully eliminated room reservation collisions across all tested scenarios, while client-side *html2pdf.js* receipt rendering bypassed server-side storage and computational bottlenecks.</w:t>
       </w:r>
     </w:p>
     <w:p>
@@ -1102,7 +990,7 @@
         </w:rPr>
         <w:t>To advance research in digital property management systems, five future technical directions are identified:</w:t>
         <w:br/>
-        <w:t>1. *Multi-Branch Architectural Scaling*: Expanding the relational schema with a `cabang_id` foreign key and multi-tenant scoping to support distributed, multi-property portfolios under centralized administration.</w:t>
+        <w:t>1. *Multi-Branch Architectural Scaling*: Expanding the relational schema with a foreign key (*cabang_id*) and multi-tenant scoping to support distributed, multi-property portfolios under centralized administration.</w:t>
         <w:br/>
         <w:t>2. *Native Mobile Client Development*: Developing dedicated iOS and Android mobile interfaces using Flutter or React Native, interacting with backend services through Laravel Sanctum-secured RESTful endpoints.</w:t>
         <w:br/>

</xml_diff>